<commit_message>
fix(api): add equipment payment placeholders
</commit_message>
<xml_diff>
--- a/services/api/assets/templates/equipment-rental-real-v1.docx
+++ b/services/api/assets/templates/equipment-rental-real-v1.docx
@@ -7652,171 +7652,7 @@
         </w:rPr>
       </w:pPr>
       <w:r>
-        <w:rPr>
-          <w:rFonts w:hint="eastAsia" w:ascii="仿宋" w:hAnsi="仿宋" w:eastAsia="仿宋"/>
-          <w:color w:val="000000" w:themeColor="text1"/>
-          <w:sz w:val="24"/>
-          <w:szCs w:val="24"/>
-          <w:highlight w:val="none"/>
-          <w:lang w:val="en-US" w:eastAsia="zh-CN"/>
-          <w14:textFill>
-            <w14:solidFill>
-              <w14:schemeClr w14:val="tx1"/>
-            </w14:solidFill>
-          </w14:textFill>
-        </w:rPr>
-        <w:t>（1）租金按</w:t>
-      </w:r>
-      <w:r>
-        <w:rPr>
-          <w:rFonts w:hint="eastAsia" w:ascii="仿宋" w:hAnsi="仿宋" w:eastAsia="仿宋"/>
-          <w:color w:val="FF0000"/>
-          <w:sz w:val="24"/>
-          <w:szCs w:val="24"/>
-          <w:highlight w:val="none"/>
-          <w:u w:val="single"/>
-          <w:lang w:val="en-US" w:eastAsia="zh-CN"/>
-        </w:rPr>
-        <w:t>月</w:t>
-      </w:r>
-      <w:r>
-        <w:rPr>
-          <w:rFonts w:hint="eastAsia" w:ascii="仿宋" w:hAnsi="仿宋" w:eastAsia="仿宋"/>
-          <w:color w:val="000000" w:themeColor="text1"/>
-          <w:sz w:val="24"/>
-          <w:szCs w:val="24"/>
-          <w:highlight w:val="none"/>
-          <w:lang w:val="en-US" w:eastAsia="zh-CN"/>
-          <w14:textFill>
-            <w14:solidFill>
-              <w14:schemeClr w14:val="tx1"/>
-            </w14:solidFill>
-          </w14:textFill>
-        </w:rPr>
-        <w:t>支付。在当期结算时，扣除现场实际发生的违约金和罚款、甲供材料费、农民工工资保证金等按合同约定应当扣除的款项后，以剩余款项作为当期结算，甲方在收到乙方开具的正式发票后，</w:t>
-      </w:r>
-      <w:r>
-        <w:rPr>
-          <w:rFonts w:hint="eastAsia" w:ascii="仿宋" w:hAnsi="仿宋" w:eastAsia="仿宋"/>
-          <w:color w:val="FF0000"/>
-          <w:sz w:val="24"/>
-          <w:szCs w:val="24"/>
-          <w:highlight w:val="none"/>
-          <w:u w:val="single"/>
-          <w:lang w:val="en-US" w:eastAsia="zh-CN"/>
-        </w:rPr>
-        <w:t xml:space="preserve">  15  </w:t>
-      </w:r>
-      <w:r>
-        <w:rPr>
-          <w:rFonts w:hint="eastAsia" w:ascii="仿宋" w:hAnsi="仿宋" w:eastAsia="仿宋"/>
-          <w:color w:val="000000" w:themeColor="text1"/>
-          <w:sz w:val="24"/>
-          <w:szCs w:val="24"/>
-          <w:highlight w:val="none"/>
-          <w:lang w:val="en-US" w:eastAsia="zh-CN"/>
-          <w14:textFill>
-            <w14:solidFill>
-              <w14:schemeClr w14:val="tx1"/>
-            </w14:solidFill>
-          </w14:textFill>
-        </w:rPr>
-        <w:t>日内向乙方支付当期结算金额的</w:t>
-      </w:r>
-      <w:r>
-        <w:rPr>
-          <w:rFonts w:hint="eastAsia" w:ascii="仿宋" w:hAnsi="仿宋" w:eastAsia="仿宋"/>
-          <w:color w:val="FF0000"/>
-          <w:sz w:val="24"/>
-          <w:szCs w:val="24"/>
-          <w:highlight w:val="none"/>
-          <w:u w:val="single"/>
-          <w:lang w:val="en-US" w:eastAsia="zh-CN"/>
-        </w:rPr>
-        <w:t xml:space="preserve">  80  </w:t>
-      </w:r>
-      <w:r>
-        <w:rPr>
-          <w:rFonts w:hint="eastAsia" w:ascii="仿宋" w:hAnsi="仿宋" w:eastAsia="仿宋"/>
-          <w:color w:val="000000" w:themeColor="text1"/>
-          <w:sz w:val="24"/>
-          <w:szCs w:val="24"/>
-          <w:highlight w:val="none"/>
-          <w:lang w:val="en-US" w:eastAsia="zh-CN"/>
-          <w14:textFill>
-            <w14:solidFill>
-              <w14:schemeClr w14:val="tx1"/>
-            </w14:solidFill>
-          </w14:textFill>
-        </w:rPr>
-        <w:t>%，剩余</w:t>
-      </w:r>
-      <w:r>
-        <w:rPr>
-          <w:rFonts w:hint="eastAsia" w:ascii="仿宋" w:hAnsi="仿宋" w:eastAsia="仿宋"/>
-          <w:color w:val="FF0000"/>
-          <w:sz w:val="24"/>
-          <w:szCs w:val="24"/>
-          <w:highlight w:val="none"/>
-          <w:u w:val="single"/>
-          <w:lang w:val="en-US" w:eastAsia="zh-CN"/>
-        </w:rPr>
-        <w:t xml:space="preserve">  20  </w:t>
-      </w:r>
-      <w:r>
-        <w:rPr>
-          <w:rFonts w:hint="eastAsia" w:ascii="仿宋" w:hAnsi="仿宋" w:eastAsia="仿宋"/>
-          <w:color w:val="000000" w:themeColor="text1"/>
-          <w:sz w:val="24"/>
-          <w:szCs w:val="24"/>
-          <w:highlight w:val="none"/>
-          <w:lang w:val="en-US" w:eastAsia="zh-CN"/>
-          <w14:textFill>
-            <w14:solidFill>
-              <w14:schemeClr w14:val="tx1"/>
-            </w14:solidFill>
-          </w14:textFill>
-        </w:rPr>
-        <w:t>%作为退场保证金，待租赁的机械设备安全退场后</w:t>
-      </w:r>
-      <w:r>
-        <w:rPr>
-          <w:rFonts w:hint="eastAsia" w:ascii="仿宋" w:hAnsi="仿宋" w:eastAsia="仿宋"/>
-          <w:color w:val="FF0000"/>
-          <w:sz w:val="24"/>
-          <w:szCs w:val="24"/>
-          <w:highlight w:val="none"/>
-          <w:u w:val="single"/>
-          <w:lang w:val="en-US" w:eastAsia="zh-CN"/>
-        </w:rPr>
-        <w:t xml:space="preserve">    </w:t>
-      </w:r>
-      <w:r>
-        <w:rPr>
-          <w:rFonts w:hint="eastAsia" w:ascii="仿宋" w:hAnsi="仿宋" w:eastAsia="仿宋"/>
-          <w:color w:val="000000" w:themeColor="text1"/>
-          <w:sz w:val="24"/>
-          <w:szCs w:val="24"/>
-          <w:highlight w:val="none"/>
-          <w:lang w:val="en-US" w:eastAsia="zh-CN"/>
-          <w14:textFill>
-            <w14:solidFill>
-              <w14:schemeClr w14:val="tx1"/>
-            </w14:solidFill>
-          </w14:textFill>
-        </w:rPr>
-        <w:t>日内无</w:t>
-      </w:r>
-      <w:r>
-        <w:rPr>
-          <w:rFonts w:hint="eastAsia" w:ascii="仿宋" w:hAnsi="仿宋" w:eastAsia="仿宋"/>
-          <w:color w:val="auto"/>
-          <w:sz w:val="24"/>
-          <w:szCs w:val="24"/>
-          <w:highlight w:val="none"/>
-          <w:lang w:val="en-US" w:eastAsia="zh-CN"/>
-        </w:rPr>
-        <w:t>息支付。</w:t>
+        <w:t xml:space="preserve">（1）租金按月支付。{clause.payment.text} 当期付款比例为 {field.paymentRatioPercent} %，剩余款项按合同约定条件支付。</w:t>
       </w:r>
     </w:p>
     <w:p>

</xml_diff>

<commit_message>
fix: polish phase1 contract docx templates
</commit_message>
<xml_diff>
--- a/services/api/assets/templates/equipment-rental-real-v1.docx
+++ b/services/api/assets/templates/equipment-rental-real-v1.docx
@@ -12635,7 +12635,7 @@
         </w:rPr>
         <w:drawing>
           <wp:inline distT="0" distB="0" distL="114300" distR="114300">
-            <wp:extent cx="7719695" cy="5787390"/>
+            <wp:extent cx="6500000" cy="4875000"/>
             <wp:effectExtent l="0" t="0" r="3810" b="14605"/>
             <wp:docPr id="1" name="图片 1" descr="cccbd124061eebda02b0a6fe2af85974"/>
             <wp:cNvGraphicFramePr>
@@ -12657,9 +12657,9 @@
                     </a:stretch>
                   </pic:blipFill>
                   <pic:spPr>
-                    <a:xfrm rot="16200000">
+                    <a:xfrm>
                       <a:off x="0" y="0"/>
-                      <a:ext cx="7719695" cy="5787390"/>
+                      <a:ext cx="6500000" cy="4875000"/>
                     </a:xfrm>
                     <a:prstGeom prst="rect">
                       <a:avLst/>

</xml_diff>

<commit_message>
fix: align contract master layout
</commit_message>
<xml_diff>
--- a/services/api/assets/templates/equipment-rental-real-v1.docx
+++ b/services/api/assets/templates/equipment-rental-real-v1.docx
@@ -4,41 +4,282 @@
   <w:body>
     <w:p>
       <w:pPr>
-        <w:spacing w:before="0" w:after="0" w:line="500" w:lineRule="exact"/>
+        <w:pStyle w:val="ContractMeta"/>
+      </w:pPr>
+      <w:r>
+        <w:t xml:space="preserve"> </w:t>
+      </w:r>
+    </w:p>
+    <w:p>
+      <w:pPr>
+        <w:pStyle w:val="ContractMeta"/>
+      </w:pPr>
+      <w:r>
+        <w:t xml:space="preserve"> </w:t>
+      </w:r>
+    </w:p>
+    <w:p>
+      <w:pPr>
+        <w:pStyle w:val="ContractMeta"/>
+      </w:pPr>
+      <w:r>
+        <w:t xml:space="preserve"> </w:t>
+      </w:r>
+    </w:p>
+    <w:p>
+      <w:pPr>
+        <w:pStyle w:val="ContractMeta"/>
+      </w:pPr>
+      <w:r>
+        <w:t xml:space="preserve"> </w:t>
+      </w:r>
+    </w:p>
+    <w:p>
+      <w:pPr>
+        <w:pStyle w:val="ContractMeta"/>
+      </w:pPr>
+      <w:r>
+        <w:t xml:space="preserve"> </w:t>
+      </w:r>
+    </w:p>
+    <w:p>
+      <w:pPr>
+        <w:pStyle w:val="ContractCoverTitle"/>
         <w:jc w:val="center"/>
-        <w:rPr>
-          <w:rFonts w:hint="eastAsia" w:ascii="Times New Roman" w:hAnsi="Times New Roman" w:eastAsia="仿宋_GB2312" w:cs="Times New Roman"/>
-          <w:b/>
-          <w:bCs/>
-          <w:color w:val="000000" w:themeColor="text1"/>
+      </w:pPr>
+      <w:r>
+        <w:rPr>
+          <w:rFonts w:ascii="Times New Roman" w:hAnsi="Times New Roman" w:eastAsia="方正小标宋简体" w:cs="Times New Roman"/>
           <w:sz w:val="44"/>
           <w:szCs w:val="44"/>
-          <w:highlight w:val="none"/>
-          <w14:textFill>
-            <w14:solidFill>
-              <w14:schemeClr w14:val="tx1"/>
-            </w14:solidFill>
-          </w14:textFill>
-        </w:rPr>
-      </w:pPr>
-    </w:p>
-    <w:p>
-      <w:pPr>
-        <w:spacing w:before="0" w:after="0" w:line="500" w:lineRule="exact"/>
+        </w:rPr>
+        <w:t xml:space="preserve">{contract.name}</w:t>
+      </w:r>
+    </w:p>
+    <w:p>
+      <w:pPr>
+        <w:pStyle w:val="ContractMeta"/>
+      </w:pPr>
+      <w:r>
+        <w:t xml:space="preserve"> </w:t>
+      </w:r>
+    </w:p>
+    <w:p>
+      <w:pPr>
+        <w:pStyle w:val="ContractMeta"/>
+      </w:pPr>
+      <w:r>
+        <w:t xml:space="preserve"> </w:t>
+      </w:r>
+    </w:p>
+    <w:p>
+      <w:pPr>
+        <w:pStyle w:val="ContractMeta"/>
+      </w:pPr>
+      <w:r>
+        <w:t xml:space="preserve"> </w:t>
+      </w:r>
+    </w:p>
+    <w:p>
+      <w:pPr>
+        <w:pStyle w:val="ContractMeta"/>
+      </w:pPr>
+      <w:r>
+        <w:t xml:space="preserve"> </w:t>
+      </w:r>
+    </w:p>
+    <w:p>
+      <w:pPr>
+        <w:pStyle w:val="ContractMeta"/>
+      </w:pPr>
+      <w:r>
+        <w:t xml:space="preserve"> </w:t>
+      </w:r>
+    </w:p>
+    <w:p>
+      <w:pPr>
+        <w:pStyle w:val="ContractMeta"/>
+      </w:pPr>
+      <w:r>
+        <w:t xml:space="preserve"> </w:t>
+      </w:r>
+    </w:p>
+    <w:p>
+      <w:pPr>
+        <w:pStyle w:val="ContractMeta"/>
+      </w:pPr>
+      <w:r>
+        <w:rPr>
+          <w:rFonts w:ascii="Times New Roman" w:hAnsi="Times New Roman" w:eastAsia="仿宋_GB2312" w:cs="Times New Roman"/>
+          <w:sz w:val="28"/>
+          <w:szCs w:val="28"/>
+        </w:rPr>
+        <w:t xml:space="preserve">合同编号：{contract.temporaryCode}</w:t>
+      </w:r>
+    </w:p>
+    <w:p>
+      <w:pPr>
+        <w:pStyle w:val="ContractMeta"/>
+      </w:pPr>
+      <w:r>
+        <w:rPr>
+          <w:rFonts w:ascii="Times New Roman" w:hAnsi="Times New Roman" w:eastAsia="仿宋_GB2312" w:cs="Times New Roman"/>
+          <w:sz w:val="28"/>
+          <w:szCs w:val="28"/>
+        </w:rPr>
+        <w:t xml:space="preserve">甲方：{party.owner.name}</w:t>
+      </w:r>
+    </w:p>
+    <w:p>
+      <w:pPr>
+        <w:pStyle w:val="ContractMeta"/>
+      </w:pPr>
+      <w:r>
+        <w:rPr>
+          <w:rFonts w:ascii="Times New Roman" w:hAnsi="Times New Roman" w:eastAsia="仿宋_GB2312" w:cs="Times New Roman"/>
+          <w:sz w:val="28"/>
+          <w:szCs w:val="28"/>
+        </w:rPr>
+        <w:t xml:space="preserve">乙方：{party.counterparty.name}</w:t>
+      </w:r>
+    </w:p>
+    <w:p>
+      <w:pPr>
+        <w:pStyle w:val="ContractMeta"/>
+      </w:pPr>
+      <w:r>
+        <w:rPr>
+          <w:rFonts w:ascii="Times New Roman" w:hAnsi="Times New Roman" w:eastAsia="仿宋_GB2312" w:cs="Times New Roman"/>
+          <w:sz w:val="28"/>
+          <w:szCs w:val="28"/>
+        </w:rPr>
+        <w:t xml:space="preserve">工程名称：{field.useLocation}</w:t>
+      </w:r>
+    </w:p>
+    <w:p>
+      <w:pPr>
+        <w:pStyle w:val="ContractMeta"/>
+      </w:pPr>
+      <w:r>
+        <w:rPr>
+          <w:rFonts w:ascii="Times New Roman" w:hAnsi="Times New Roman" w:eastAsia="仿宋_GB2312" w:cs="Times New Roman"/>
+          <w:sz w:val="28"/>
+          <w:szCs w:val="28"/>
+        </w:rPr>
+        <w:t xml:space="preserve">签订地点：</w:t>
+      </w:r>
+    </w:p>
+    <w:p>
+      <w:pPr>
+        <w:pStyle w:val="ContractMeta"/>
+      </w:pPr>
+      <w:r>
+        <w:rPr>
+          <w:rFonts w:ascii="Times New Roman" w:hAnsi="Times New Roman" w:eastAsia="仿宋_GB2312" w:cs="Times New Roman"/>
+          <w:sz w:val="28"/>
+          <w:szCs w:val="28"/>
+        </w:rPr>
+        <w:t xml:space="preserve">签订日期：</w:t>
+      </w:r>
+    </w:p>
+    <w:p>
+      <w:pPr>
+        <w:pStyle w:val="ContractMeta"/>
+      </w:pPr>
+      <w:r>
+        <w:t xml:space="preserve"> </w:t>
+      </w:r>
+    </w:p>
+    <w:p>
+      <w:pPr>
+        <w:pStyle w:val="ContractMeta"/>
+      </w:pPr>
+      <w:r>
+        <w:t xml:space="preserve"> </w:t>
+      </w:r>
+    </w:p>
+    <w:p>
+      <w:pPr>
+        <w:pStyle w:val="ContractMeta"/>
+      </w:pPr>
+      <w:r>
+        <w:t xml:space="preserve"> </w:t>
+      </w:r>
+    </w:p>
+    <w:p>
+      <w:pPr>
+        <w:pStyle w:val="ContractMeta"/>
+      </w:pPr>
+      <w:r>
+        <w:t xml:space="preserve"> </w:t>
+      </w:r>
+    </w:p>
+    <w:p>
+      <w:pPr>
+        <w:pStyle w:val="ContractMeta"/>
+      </w:pPr>
+      <w:r>
+        <w:t xml:space="preserve"> </w:t>
+      </w:r>
+    </w:p>
+    <w:p>
+      <w:pPr>
+        <w:pStyle w:val="ContractMeta"/>
+      </w:pPr>
+      <w:r>
+        <w:t xml:space="preserve"> </w:t>
+      </w:r>
+    </w:p>
+    <w:p>
+      <w:pPr>
+        <w:pStyle w:val="ContractMeta"/>
+      </w:pPr>
+      <w:r>
+        <w:t xml:space="preserve"> </w:t>
+      </w:r>
+    </w:p>
+    <w:p>
+      <w:pPr>
+        <w:sectPr>
+          <w:type w:val="nextPage"/>
+          <w:headerReference w:type="default" r:id="rIdHeader1"/>
+          <w:footerReference w:type="default" r:id="rIdFooter1"/>
+          <w:pgSz w:w="11906" w:h="16838"/>
+          <w:pgMar w:top="1417" w:right="1701" w:bottom="1417" w:left="1701" w:header="720" w:footer="720" w:gutter="0"/>
+        </w:sectPr>
+      </w:pPr>
+    </w:p>
+    <w:p>
+      <w:pPr>
+        <w:pStyle w:val="ContractTitle"/>
         <w:jc w:val="center"/>
+      </w:pPr>
+      <w:r>
+        <w:t xml:space="preserve">{contract.name}</w:t>
+      </w:r>
+    </w:p>
+    <w:p>
+      <w:pPr>
+        <w:spacing w:before="0" w:after="0" w:line="500" w:lineRule="exact"/>
+        <w:ind w:firstLine="1544" w:firstLineChars="641"/>
         <w:rPr>
           <w:rFonts w:hint="eastAsia" w:ascii="Times New Roman" w:hAnsi="Times New Roman" w:eastAsia="仿宋_GB2312" w:cs="Times New Roman"/>
           <w:b/>
           <w:bCs/>
-          <w:color w:val="000000" w:themeColor="text1"/>
-          <w:sz w:val="44"/>
-          <w:szCs w:val="44"/>
-          <w:highlight w:val="none"/>
-          <w14:textFill>
-            <w14:solidFill>
-              <w14:schemeClr w14:val="tx1"/>
-            </w14:solidFill>
-          </w14:textFill>
+          <w:sz w:val="28"/>
+          <w:szCs w:val="28"/>
+          <w:highlight w:val="none"/>
+        </w:rPr>
+      </w:pPr>
+    </w:p>
+    <w:p>
+      <w:pPr>
+        <w:spacing w:before="0" w:after="0" w:line="500" w:lineRule="exact"/>
+        <w:rPr>
+          <w:rFonts w:hint="eastAsia" w:ascii="Times New Roman" w:hAnsi="Times New Roman" w:eastAsia="仿宋_GB2312" w:cs="Times New Roman"/>
+          <w:sz w:val="28"/>
+          <w:szCs w:val="28"/>
+          <w:highlight w:val="none"/>
         </w:rPr>
       </w:pPr>
       <w:r>
@@ -46,631 +287,111 @@
           <w:rFonts w:hint="eastAsia" w:ascii="Times New Roman" w:hAnsi="Times New Roman" w:eastAsia="仿宋_GB2312" w:cs="Times New Roman"/>
           <w:b/>
           <w:bCs/>
-          <w:color w:val="000000" w:themeColor="text1"/>
-          <w:sz w:val="44"/>
-          <w:szCs w:val="44"/>
-          <w:highlight w:val="none"/>
-          <w14:textFill>
-            <w14:solidFill>
-              <w14:schemeClr w14:val="tx1"/>
-            </w14:solidFill>
-          </w14:textFill>
-        </w:rPr>
-        <w:t>工程机械设备</w:t>
-      </w:r>
-    </w:p>
-    <w:p>
-      <w:pPr>
-        <w:spacing w:before="0" w:after="0" w:line="500" w:lineRule="exact"/>
-        <w:jc w:val="center"/>
+          <w:sz w:val="28"/>
+          <w:szCs w:val="28"/>
+          <w:highlight w:val="none"/>
+        </w:rPr>
+        <w:t>甲方（承租方</w:t>
+      </w:r>
+      <w:bookmarkStart w:id="0" w:name="OLE_LINK2"/>
+      <w:r>
         <w:rPr>
           <w:rFonts w:hint="eastAsia" w:ascii="Times New Roman" w:hAnsi="Times New Roman" w:eastAsia="仿宋_GB2312" w:cs="Times New Roman"/>
           <w:b/>
           <w:bCs/>
-          <w:color w:val="000000" w:themeColor="text1"/>
-          <w:sz w:val="44"/>
-          <w:szCs w:val="44"/>
-          <w:highlight w:val="none"/>
-          <w14:textFill>
-            <w14:solidFill>
-              <w14:schemeClr w14:val="tx1"/>
-            </w14:solidFill>
-          </w14:textFill>
-        </w:rPr>
-      </w:pPr>
+          <w:sz w:val="28"/>
+          <w:szCs w:val="28"/>
+          <w:highlight w:val="none"/>
+        </w:rPr>
+        <w:t>）</w:t>
+      </w:r>
+      <w:bookmarkEnd w:id="0"/>
       <w:r>
         <w:rPr>
           <w:rFonts w:hint="eastAsia" w:ascii="Times New Roman" w:hAnsi="Times New Roman" w:eastAsia="仿宋_GB2312" w:cs="Times New Roman"/>
           <w:b/>
           <w:bCs/>
-          <w:color w:val="000000" w:themeColor="text1"/>
-          <w:sz w:val="44"/>
-          <w:szCs w:val="44"/>
-          <w:highlight w:val="none"/>
-          <w14:textFill>
-            <w14:solidFill>
-              <w14:schemeClr w14:val="tx1"/>
-            </w14:solidFill>
-          </w14:textFill>
-        </w:rPr>
-        <w:t>租赁服务合同</w:t>
-      </w:r>
-    </w:p>
-    <w:p>
-      <w:pPr>
-        <w:spacing w:before="0" w:after="0" w:line="500" w:lineRule="exact"/>
-        <w:rPr>
-          <w:rFonts w:hint="eastAsia" w:ascii="Times New Roman" w:hAnsi="Times New Roman" w:eastAsia="仿宋_GB2312" w:cs="Times New Roman"/>
-          <w:sz w:val="44"/>
-          <w:szCs w:val="44"/>
-          <w:highlight w:val="none"/>
-        </w:rPr>
-      </w:pPr>
-    </w:p>
-    <w:p>
-      <w:pPr>
-        <w:spacing w:before="0" w:after="0" w:line="500" w:lineRule="exact"/>
-        <w:rPr>
-          <w:rFonts w:hint="eastAsia" w:ascii="Times New Roman" w:hAnsi="Times New Roman" w:eastAsia="仿宋_GB2312" w:cs="Times New Roman"/>
-          <w:sz w:val="44"/>
-          <w:szCs w:val="44"/>
-          <w:highlight w:val="none"/>
-        </w:rPr>
-      </w:pPr>
-    </w:p>
-    <w:p>
-      <w:pPr>
-        <w:spacing w:before="0" w:after="0" w:line="500" w:lineRule="exact"/>
-        <w:rPr>
-          <w:rFonts w:hint="eastAsia" w:ascii="Times New Roman" w:hAnsi="Times New Roman" w:eastAsia="仿宋_GB2312" w:cs="Times New Roman"/>
-          <w:sz w:val="44"/>
-          <w:szCs w:val="44"/>
-          <w:highlight w:val="none"/>
-        </w:rPr>
-      </w:pPr>
-    </w:p>
-    <w:p>
-      <w:pPr>
-        <w:pStyle w:val="2"/>
-        <w:rPr>
-          <w:rFonts w:hint="eastAsia"/>
-        </w:rPr>
-      </w:pPr>
-    </w:p>
-    <w:p>
-      <w:pPr>
-        <w:spacing w:before="0" w:after="0" w:line="500" w:lineRule="exact"/>
-        <w:rPr>
-          <w:rFonts w:hint="eastAsia" w:ascii="Times New Roman" w:hAnsi="Times New Roman" w:eastAsia="仿宋_GB2312" w:cs="Times New Roman"/>
-          <w:sz w:val="44"/>
-          <w:szCs w:val="44"/>
-          <w:highlight w:val="none"/>
-        </w:rPr>
-      </w:pPr>
-    </w:p>
-    <w:p>
-      <w:pPr>
-        <w:spacing w:before="0" w:after="0" w:line="500" w:lineRule="exact"/>
-        <w:rPr>
-          <w:rFonts w:hint="default" w:ascii="Times New Roman" w:hAnsi="Times New Roman" w:eastAsia="仿宋_GB2312" w:cs="Times New Roman"/>
+          <w:sz w:val="28"/>
+          <w:szCs w:val="28"/>
+          <w:highlight w:val="none"/>
+        </w:rPr>
+        <w:t>：</w:t>
+      </w:r>
+      <w:r>
+        <w:rPr>
+          <w:rFonts w:hint="eastAsia" w:ascii="Times New Roman" w:hAnsi="Times New Roman" w:eastAsia="仿宋_GB2312" w:cs="Times New Roman"/>
+          <w:color w:val="auto"/>
+          <w:sz w:val="28"/>
+          <w:szCs w:val="28"/>
+          <w:highlight w:val="none"/>
+          <w:u w:val="single"/>
+        </w:rPr>
+        <w:t xml:space="preserve">  </w:t>
+      </w:r>
+      <w:r>
+        <w:rPr>
+          <w:rFonts w:hint="eastAsia" w:ascii="Times New Roman" w:hAnsi="Times New Roman" w:eastAsia="仿宋_GB2312" w:cs="Times New Roman"/>
           <w:b/>
-          <w:bCs/>
+          <w:sz w:val="28"/>
+          <w:szCs w:val="28"/>
+          <w:u w:val="single"/>
+        </w:rPr>
+        <w:t>{party.owner.name}</w:t>
+      </w:r>
+      <w:r>
+        <w:rPr>
+          <w:rFonts w:hint="eastAsia" w:ascii="Times New Roman" w:hAnsi="Times New Roman" w:eastAsia="仿宋_GB2312" w:cs="Times New Roman"/>
+          <w:color w:val="auto"/>
+          <w:sz w:val="28"/>
+          <w:szCs w:val="28"/>
+          <w:highlight w:val="none"/>
+          <w:u w:val="single"/>
+        </w:rPr>
+        <w:t xml:space="preserve">   </w:t>
+      </w:r>
+    </w:p>
+    <w:p>
+      <w:pPr>
+        <w:spacing w:before="0" w:after="0" w:line="500" w:lineRule="exact"/>
+        <w:rPr>
+          <w:rFonts w:hint="eastAsia" w:ascii="Times New Roman" w:hAnsi="Times New Roman" w:eastAsia="仿宋_GB2312" w:cs="Times New Roman"/>
+          <w:sz w:val="28"/>
+          <w:szCs w:val="28"/>
+          <w:highlight w:val="none"/>
+        </w:rPr>
+      </w:pPr>
+      <w:r>
+        <w:rPr>
+          <w:rFonts w:hint="eastAsia" w:ascii="Times New Roman" w:hAnsi="Times New Roman" w:eastAsia="仿宋_GB2312" w:cs="Times New Roman"/>
+          <w:b/>
+          <w:bCs/>
+          <w:sz w:val="28"/>
+          <w:szCs w:val="28"/>
+          <w:highlight w:val="none"/>
+        </w:rPr>
+        <w:t>乙方（出租方）：</w:t>
+      </w:r>
+      <w:r>
+        <w:rPr>
+          <w:rFonts w:hint="eastAsia" w:ascii="Times New Roman" w:hAnsi="Times New Roman" w:eastAsia="仿宋_GB2312" w:cs="Times New Roman"/>
+          <w:color w:val="auto"/>
+          <w:sz w:val="28"/>
+          <w:szCs w:val="28"/>
+          <w:highlight w:val="none"/>
+          <w:u w:val="single"/>
+        </w:rPr>
+        <w:t xml:space="preserve">   </w:t>
+      </w:r>
+      <w:r>
+        <w:rPr>
+          <w:rFonts w:hint="eastAsia" w:ascii="Times New Roman" w:hAnsi="Times New Roman" w:eastAsia="仿宋_GB2312" w:cs="Times New Roman"/>
+          <w:b/>
+          <w:bCs/>
+          <w:color w:val="auto"/>
           <w:sz w:val="36"/>
           <w:szCs w:val="36"/>
           <w:highlight w:val="none"/>
           <w:u w:val="single"/>
-          <w:lang w:val="en-US" w:eastAsia="仿宋_GB2312"/>
-        </w:rPr>
-      </w:pPr>
-      <w:r>
-        <w:t xml:space="preserve">合同编号：{contract.temporaryCode}</w:t>
-      </w:r>
-    </w:p>
-    <w:p>
-      <w:pPr>
-        <w:spacing w:before="0" w:after="0" w:line="500" w:lineRule="exact"/>
-        <w:outlineLvl w:val="9"/>
-        <w:rPr>
-          <w:rFonts w:hint="default" w:eastAsia="仿宋_GB2312"/>
-          <w:b/>
-          <w:sz w:val="36"/>
-          <w:szCs w:val="36"/>
-          <w:u w:val="single"/>
-          <w:lang w:val="en-US" w:eastAsia="仿宋_GB2312"/>
-        </w:rPr>
-      </w:pPr>
-      <w:r>
-        <w:rPr>
-          <w:rFonts w:hint="eastAsia" w:ascii="Times New Roman" w:hAnsi="Times New Roman" w:eastAsia="仿宋_GB2312" w:cs="Times New Roman"/>
-          <w:b/>
-          <w:bCs/>
-          <w:sz w:val="36"/>
-          <w:szCs w:val="36"/>
-          <w:highlight w:val="none"/>
-        </w:rPr>
-        <w:t>甲方（承租方）：</w:t>
-      </w:r>
-      <w:r>
-        <w:rPr>
-          <w:rFonts w:hint="eastAsia" w:ascii="Times New Roman" w:hAnsi="Times New Roman" w:eastAsia="仿宋_GB2312" w:cs="Times New Roman"/>
-          <w:b/>
-          <w:sz w:val="28"/>
-          <w:szCs w:val="28"/>
-          <w:u w:val="single"/>
-        </w:rPr>
-        <w:t>{party.owner.name}</w:t>
-      </w:r>
-      <w:r>
-        <w:rPr>
-          <w:rFonts w:hint="eastAsia" w:ascii="Times New Roman" w:hAnsi="Times New Roman" w:eastAsia="仿宋_GB2312" w:cs="Times New Roman"/>
-          <w:b/>
-          <w:sz w:val="28"/>
-          <w:szCs w:val="28"/>
-          <w:u w:val="single"/>
-          <w:lang w:val="en-US" w:eastAsia="仿宋_GB2312"/>
-        </w:rPr>
-        <w:t xml:space="preserve">            </w:t>
-      </w:r>
-    </w:p>
-    <w:p>
-      <w:pPr>
-        <w:spacing w:before="0" w:after="0" w:line="500" w:lineRule="exact"/>
-        <w:rPr>
-          <w:rFonts w:hint="eastAsia" w:ascii="Times New Roman" w:hAnsi="Times New Roman" w:eastAsia="仿宋_GB2312" w:cs="Times New Roman"/>
-          <w:b/>
-          <w:bCs/>
-          <w:sz w:val="36"/>
-          <w:szCs w:val="36"/>
-          <w:highlight w:val="none"/>
-        </w:rPr>
-      </w:pPr>
-      <w:r>
-        <w:rPr>
-          <w:rFonts w:hint="eastAsia" w:ascii="Times New Roman" w:hAnsi="Times New Roman" w:eastAsia="仿宋_GB2312" w:cs="Times New Roman"/>
-          <w:b/>
-          <w:bCs/>
-          <w:sz w:val="36"/>
-          <w:szCs w:val="36"/>
-          <w:highlight w:val="none"/>
-        </w:rPr>
-        <w:t>乙方（出租方）：</w:t>
-      </w:r>
-      <w:r>
-        <w:rPr>
-          <w:rFonts w:hint="eastAsia" w:ascii="Times New Roman" w:hAnsi="Times New Roman" w:eastAsia="仿宋_GB2312" w:cs="Times New Roman"/>
-          <w:b/>
-          <w:bCs/>
-          <w:color w:val="auto"/>
-          <w:sz w:val="36"/>
-          <w:szCs w:val="36"/>
-          <w:highlight w:val="none"/>
-          <w:u w:val="single"/>
-        </w:rPr>
-        <w:t xml:space="preserve"> {party.counterparty.name}     </w:t>
-      </w:r>
-    </w:p>
-    <w:p>
-      <w:pPr>
-        <w:spacing w:before="0" w:after="0" w:line="500" w:lineRule="exact"/>
-        <w:rPr>
-          <w:rFonts w:hint="eastAsia" w:ascii="Times New Roman" w:hAnsi="Times New Roman" w:eastAsia="仿宋_GB2312" w:cs="Times New Roman"/>
-          <w:b/>
-          <w:bCs/>
-          <w:sz w:val="36"/>
-          <w:szCs w:val="36"/>
-          <w:highlight w:val="none"/>
-        </w:rPr>
-      </w:pPr>
-      <w:r>
-        <w:rPr>
-          <w:rFonts w:hint="eastAsia" w:ascii="Times New Roman" w:hAnsi="Times New Roman" w:eastAsia="仿宋_GB2312" w:cs="Times New Roman"/>
-          <w:b/>
-          <w:bCs/>
-          <w:sz w:val="36"/>
-          <w:szCs w:val="36"/>
-          <w:highlight w:val="none"/>
-        </w:rPr>
-        <w:t>工程名称：</w:t>
-      </w:r>
-      <w:r>
-        <w:rPr>
-          <w:rFonts w:hint="eastAsia" w:ascii="Times New Roman" w:hAnsi="Times New Roman" w:eastAsia="仿宋_GB2312" w:cs="Times New Roman"/>
-          <w:b/>
-          <w:bCs/>
-          <w:color w:val="auto"/>
-          <w:sz w:val="36"/>
-          <w:szCs w:val="36"/>
-          <w:highlight w:val="none"/>
-          <w:u w:val="single"/>
-        </w:rPr>
-        <w:t xml:space="preserve"> {field.useLocation} </w:t>
-      </w:r>
-      <w:r>
-        <w:rPr>
-          <w:rFonts w:ascii="Times New Roman" w:hAnsi="Times New Roman" w:eastAsia="仿宋_GB2312" w:cs="Times New Roman"/>
-          <w:b/>
-          <w:bCs/>
-          <w:color w:val="auto"/>
-          <w:sz w:val="36"/>
-          <w:szCs w:val="36"/>
-          <w:highlight w:val="none"/>
-          <w:u w:val="single"/>
-        </w:rPr>
-        <w:t xml:space="preserve"> </w:t>
-      </w:r>
-      <w:r>
-        <w:rPr>
-          <w:rFonts w:hint="eastAsia" w:ascii="Times New Roman" w:hAnsi="Times New Roman" w:eastAsia="仿宋_GB2312" w:cs="Times New Roman"/>
-          <w:b/>
-          <w:bCs/>
-          <w:color w:val="auto"/>
-          <w:sz w:val="36"/>
-          <w:szCs w:val="36"/>
-          <w:highlight w:val="none"/>
-          <w:u w:val="single"/>
-        </w:rPr>
-        <w:t xml:space="preserve">  </w:t>
-      </w:r>
-    </w:p>
-    <w:p>
-      <w:pPr>
-        <w:spacing w:before="0" w:after="0" w:line="500" w:lineRule="exact"/>
-        <w:rPr>
-          <w:rFonts w:hint="eastAsia" w:ascii="Times New Roman" w:hAnsi="Times New Roman" w:eastAsia="仿宋_GB2312" w:cs="Times New Roman"/>
-          <w:b/>
-          <w:bCs/>
-          <w:sz w:val="36"/>
-          <w:szCs w:val="36"/>
-          <w:highlight w:val="none"/>
-        </w:rPr>
-      </w:pPr>
-      <w:r>
-        <w:rPr>
-          <w:rFonts w:hint="eastAsia" w:ascii="Times New Roman" w:hAnsi="Times New Roman" w:eastAsia="仿宋_GB2312" w:cs="Times New Roman"/>
-          <w:b/>
-          <w:bCs/>
-          <w:sz w:val="36"/>
-          <w:szCs w:val="36"/>
-          <w:highlight w:val="none"/>
-        </w:rPr>
-        <w:t>签订地点：</w:t>
-      </w:r>
-      <w:r>
-        <w:rPr>
-          <w:rFonts w:hint="eastAsia" w:ascii="Times New Roman" w:hAnsi="Times New Roman" w:eastAsia="仿宋_GB2312" w:cs="Times New Roman"/>
-          <w:b/>
-          <w:bCs/>
-          <w:color w:val="auto"/>
-          <w:sz w:val="36"/>
-          <w:szCs w:val="36"/>
-          <w:highlight w:val="none"/>
-          <w:u w:val="single"/>
-        </w:rPr>
-        <w:t xml:space="preserve"> </w:t>
-      </w:r>
-      <w:r>
-        <w:rPr>
-          <w:rFonts w:hint="eastAsia" w:ascii="Times New Roman" w:hAnsi="Times New Roman" w:eastAsia="仿宋_GB2312" w:cs="Times New Roman"/>
-          <w:b/>
-          <w:bCs/>
-          <w:color w:val="auto"/>
-          <w:sz w:val="36"/>
-          <w:szCs w:val="36"/>
-          <w:highlight w:val="none"/>
-          <w:u w:val="single"/>
-          <w:lang w:eastAsia="仿宋_GB2312"/>
-        </w:rPr>
-        <w:t>昆明市西山区</w:t>
-      </w:r>
-      <w:r>
-        <w:rPr>
-          <w:rFonts w:hint="eastAsia" w:ascii="Times New Roman" w:hAnsi="Times New Roman" w:eastAsia="仿宋_GB2312" w:cs="Times New Roman"/>
-          <w:b/>
-          <w:bCs/>
-          <w:color w:val="auto"/>
-          <w:sz w:val="36"/>
-          <w:szCs w:val="36"/>
-          <w:highlight w:val="none"/>
-          <w:u w:val="single"/>
-        </w:rPr>
-        <w:t xml:space="preserve">                     </w:t>
-      </w:r>
-      <w:r>
-        <w:rPr>
-          <w:rFonts w:ascii="Times New Roman" w:hAnsi="Times New Roman" w:eastAsia="仿宋_GB2312" w:cs="Times New Roman"/>
-          <w:b/>
-          <w:bCs/>
-          <w:color w:val="auto"/>
-          <w:sz w:val="36"/>
-          <w:szCs w:val="36"/>
-          <w:highlight w:val="none"/>
-          <w:u w:val="single"/>
-        </w:rPr>
-        <w:t xml:space="preserve">    </w:t>
-      </w:r>
-      <w:r>
-        <w:rPr>
-          <w:rFonts w:hint="eastAsia" w:ascii="Times New Roman" w:hAnsi="Times New Roman" w:eastAsia="仿宋_GB2312" w:cs="Times New Roman"/>
-          <w:b/>
-          <w:bCs/>
-          <w:color w:val="auto"/>
-          <w:sz w:val="36"/>
-          <w:szCs w:val="36"/>
-          <w:highlight w:val="none"/>
-          <w:u w:val="single"/>
-        </w:rPr>
-        <w:t xml:space="preserve">     </w:t>
-      </w:r>
-      <w:r>
-        <w:rPr>
-          <w:rFonts w:ascii="Times New Roman" w:hAnsi="Times New Roman" w:eastAsia="仿宋_GB2312" w:cs="Times New Roman"/>
-          <w:b/>
-          <w:bCs/>
-          <w:color w:val="auto"/>
-          <w:sz w:val="36"/>
-          <w:szCs w:val="36"/>
-          <w:highlight w:val="none"/>
-          <w:u w:val="single"/>
-        </w:rPr>
-        <w:t xml:space="preserve"> </w:t>
-      </w:r>
-      <w:r>
-        <w:rPr>
-          <w:rFonts w:hint="eastAsia" w:ascii="Times New Roman" w:hAnsi="Times New Roman" w:eastAsia="仿宋_GB2312" w:cs="Times New Roman"/>
-          <w:b/>
-          <w:bCs/>
-          <w:color w:val="auto"/>
-          <w:sz w:val="36"/>
-          <w:szCs w:val="36"/>
-          <w:highlight w:val="none"/>
-          <w:u w:val="single"/>
-        </w:rPr>
-        <w:t xml:space="preserve">  </w:t>
-      </w:r>
-    </w:p>
-    <w:p>
-      <w:pPr>
-        <w:spacing w:before="0" w:after="0" w:line="500" w:lineRule="exact"/>
-        <w:rPr>
-          <w:rFonts w:hint="eastAsia" w:ascii="Times New Roman" w:hAnsi="Times New Roman" w:eastAsia="仿宋_GB2312"/>
-          <w:highlight w:val="none"/>
-        </w:rPr>
-      </w:pPr>
-      <w:r>
-        <w:rPr>
-          <w:rFonts w:hint="eastAsia" w:ascii="Times New Roman" w:hAnsi="Times New Roman" w:eastAsia="仿宋_GB2312" w:cs="Times New Roman"/>
-          <w:b/>
-          <w:bCs/>
-          <w:sz w:val="36"/>
-          <w:szCs w:val="36"/>
-          <w:highlight w:val="none"/>
-        </w:rPr>
-        <w:t>签订日期：</w:t>
-      </w:r>
-      <w:r>
-        <w:rPr>
-          <w:rFonts w:hint="eastAsia" w:ascii="Times New Roman" w:hAnsi="Times New Roman" w:eastAsia="仿宋_GB2312" w:cs="Times New Roman"/>
-          <w:b/>
-          <w:bCs/>
-          <w:color w:val="auto"/>
-          <w:sz w:val="36"/>
-          <w:szCs w:val="36"/>
-          <w:highlight w:val="none"/>
-          <w:u w:val="single"/>
-        </w:rPr>
-        <w:t xml:space="preserve"> </w:t>
-      </w:r>
-      <w:r>
-        <w:rPr>
-          <w:rFonts w:hint="eastAsia" w:ascii="Times New Roman" w:hAnsi="Times New Roman" w:eastAsia="仿宋_GB2312" w:cs="Times New Roman"/>
-          <w:b/>
-          <w:bCs/>
-          <w:color w:val="auto"/>
-          <w:sz w:val="36"/>
-          <w:szCs w:val="36"/>
-          <w:highlight w:val="none"/>
-          <w:u w:val="single"/>
-          <w:lang w:val="en-US" w:eastAsia="仿宋_GB2312"/>
-        </w:rPr>
-        <w:t>2026年   月   日</w:t>
-      </w:r>
-      <w:r>
-        <w:rPr>
-          <w:rFonts w:hint="eastAsia" w:ascii="Times New Roman" w:hAnsi="Times New Roman" w:eastAsia="仿宋_GB2312" w:cs="Times New Roman"/>
-          <w:b/>
-          <w:bCs/>
-          <w:color w:val="auto"/>
-          <w:sz w:val="36"/>
-          <w:szCs w:val="36"/>
-          <w:highlight w:val="none"/>
-          <w:u w:val="single"/>
-        </w:rPr>
-        <w:t xml:space="preserve">                          </w:t>
-      </w:r>
-      <w:r>
-        <w:rPr>
-          <w:rFonts w:ascii="Times New Roman" w:hAnsi="Times New Roman" w:eastAsia="仿宋_GB2312" w:cs="Times New Roman"/>
-          <w:b/>
-          <w:bCs/>
-          <w:color w:val="auto"/>
-          <w:sz w:val="36"/>
-          <w:szCs w:val="36"/>
-          <w:highlight w:val="none"/>
-          <w:u w:val="single"/>
-        </w:rPr>
-        <w:t xml:space="preserve">     </w:t>
-      </w:r>
-      <w:r>
-        <w:rPr>
-          <w:rFonts w:hint="eastAsia" w:ascii="Times New Roman" w:hAnsi="Times New Roman" w:eastAsia="仿宋_GB2312" w:cs="Times New Roman"/>
-          <w:b/>
-          <w:bCs/>
-          <w:color w:val="auto"/>
-          <w:sz w:val="36"/>
-          <w:szCs w:val="36"/>
-          <w:highlight w:val="none"/>
-          <w:u w:val="single"/>
-        </w:rPr>
-        <w:t xml:space="preserve">  </w:t>
-      </w:r>
-    </w:p>
-    <w:p>
-      <w:pPr>
-        <w:spacing w:before="0" w:after="0" w:line="500" w:lineRule="exact"/>
-        <w:jc w:val="center"/>
-        <w:rPr>
-          <w:rFonts w:hint="eastAsia" w:ascii="Times New Roman" w:hAnsi="Times New Roman" w:eastAsia="仿宋_GB2312" w:cs="Times New Roman"/>
-          <w:b/>
-          <w:bCs/>
-          <w:color w:val="000000" w:themeColor="text1"/>
-          <w:sz w:val="36"/>
-          <w:szCs w:val="36"/>
-          <w:highlight w:val="none"/>
-          <w14:textFill>
-            <w14:solidFill>
-              <w14:schemeClr w14:val="tx1"/>
-            </w14:solidFill>
-          </w14:textFill>
-        </w:rPr>
-      </w:pPr>
-      <w:r>
-        <w:t xml:space="preserve">{contract.name}</w:t>
-      </w:r>
-    </w:p>
-    <w:p>
-      <w:pPr>
-        <w:spacing w:before="0" w:after="0" w:line="500" w:lineRule="exact"/>
-        <w:ind w:firstLine="1544" w:firstLineChars="641"/>
-        <w:rPr>
-          <w:rFonts w:hint="eastAsia" w:ascii="Times New Roman" w:hAnsi="Times New Roman" w:eastAsia="仿宋_GB2312" w:cs="Times New Roman"/>
-          <w:b/>
-          <w:bCs/>
-          <w:sz w:val="28"/>
-          <w:szCs w:val="28"/>
-          <w:highlight w:val="none"/>
-        </w:rPr>
-      </w:pPr>
-    </w:p>
-    <w:p>
-      <w:pPr>
-        <w:spacing w:before="0" w:after="0" w:line="500" w:lineRule="exact"/>
-        <w:rPr>
-          <w:rFonts w:hint="eastAsia" w:ascii="Times New Roman" w:hAnsi="Times New Roman" w:eastAsia="仿宋_GB2312" w:cs="Times New Roman"/>
-          <w:sz w:val="28"/>
-          <w:szCs w:val="28"/>
-          <w:highlight w:val="none"/>
-        </w:rPr>
-      </w:pPr>
-      <w:r>
-        <w:rPr>
-          <w:rFonts w:hint="eastAsia" w:ascii="Times New Roman" w:hAnsi="Times New Roman" w:eastAsia="仿宋_GB2312" w:cs="Times New Roman"/>
-          <w:b/>
-          <w:bCs/>
-          <w:sz w:val="28"/>
-          <w:szCs w:val="28"/>
-          <w:highlight w:val="none"/>
-        </w:rPr>
-        <w:t>甲方（承租方</w:t>
-      </w:r>
-      <w:bookmarkStart w:id="0" w:name="OLE_LINK2"/>
-      <w:r>
-        <w:rPr>
-          <w:rFonts w:hint="eastAsia" w:ascii="Times New Roman" w:hAnsi="Times New Roman" w:eastAsia="仿宋_GB2312" w:cs="Times New Roman"/>
-          <w:b/>
-          <w:bCs/>
-          <w:sz w:val="28"/>
-          <w:szCs w:val="28"/>
-          <w:highlight w:val="none"/>
-        </w:rPr>
-        <w:t>）</w:t>
-      </w:r>
-      <w:bookmarkEnd w:id="0"/>
-      <w:r>
-        <w:rPr>
-          <w:rFonts w:hint="eastAsia" w:ascii="Times New Roman" w:hAnsi="Times New Roman" w:eastAsia="仿宋_GB2312" w:cs="Times New Roman"/>
-          <w:b/>
-          <w:bCs/>
-          <w:sz w:val="28"/>
-          <w:szCs w:val="28"/>
-          <w:highlight w:val="none"/>
-        </w:rPr>
-        <w:t>：</w:t>
-      </w:r>
-      <w:r>
-        <w:rPr>
-          <w:rFonts w:hint="eastAsia" w:ascii="Times New Roman" w:hAnsi="Times New Roman" w:eastAsia="仿宋_GB2312" w:cs="Times New Roman"/>
-          <w:color w:val="auto"/>
-          <w:sz w:val="28"/>
-          <w:szCs w:val="28"/>
-          <w:highlight w:val="none"/>
-          <w:u w:val="single"/>
-        </w:rPr>
-        <w:t xml:space="preserve">  </w:t>
-      </w:r>
-      <w:r>
-        <w:rPr>
-          <w:rFonts w:hint="eastAsia" w:ascii="Times New Roman" w:hAnsi="Times New Roman" w:eastAsia="仿宋_GB2312" w:cs="Times New Roman"/>
-          <w:b/>
-          <w:sz w:val="28"/>
-          <w:szCs w:val="28"/>
-          <w:u w:val="single"/>
-        </w:rPr>
-        <w:t>{party.owner.name}</w:t>
-      </w:r>
-      <w:r>
-        <w:rPr>
-          <w:rFonts w:hint="eastAsia" w:ascii="Times New Roman" w:hAnsi="Times New Roman" w:eastAsia="仿宋_GB2312" w:cs="Times New Roman"/>
-          <w:color w:val="auto"/>
-          <w:sz w:val="28"/>
-          <w:szCs w:val="28"/>
-          <w:highlight w:val="none"/>
-          <w:u w:val="single"/>
-        </w:rPr>
-        <w:t xml:space="preserve">   </w:t>
-      </w:r>
-    </w:p>
-    <w:p>
-      <w:pPr>
-        <w:spacing w:before="0" w:after="0" w:line="500" w:lineRule="exact"/>
-        <w:rPr>
-          <w:rFonts w:hint="eastAsia" w:ascii="Times New Roman" w:hAnsi="Times New Roman" w:eastAsia="仿宋_GB2312" w:cs="Times New Roman"/>
-          <w:sz w:val="28"/>
-          <w:szCs w:val="28"/>
-          <w:highlight w:val="none"/>
-        </w:rPr>
-      </w:pPr>
-      <w:r>
-        <w:rPr>
-          <w:rFonts w:hint="eastAsia" w:ascii="Times New Roman" w:hAnsi="Times New Roman" w:eastAsia="仿宋_GB2312" w:cs="Times New Roman"/>
-          <w:b/>
-          <w:bCs/>
-          <w:sz w:val="28"/>
-          <w:szCs w:val="28"/>
-          <w:highlight w:val="none"/>
-        </w:rPr>
-        <w:t>乙方（出租方）：</w:t>
-      </w:r>
-      <w:r>
-        <w:rPr>
-          <w:rFonts w:hint="eastAsia" w:ascii="Times New Roman" w:hAnsi="Times New Roman" w:eastAsia="仿宋_GB2312" w:cs="Times New Roman"/>
-          <w:color w:val="auto"/>
-          <w:sz w:val="28"/>
-          <w:szCs w:val="28"/>
-          <w:highlight w:val="none"/>
-          <w:u w:val="single"/>
-        </w:rPr>
-        <w:t xml:space="preserve">   </w:t>
-      </w:r>
-      <w:r>
-        <w:rPr>
-          <w:rFonts w:hint="eastAsia" w:ascii="Times New Roman" w:hAnsi="Times New Roman" w:eastAsia="仿宋_GB2312" w:cs="Times New Roman"/>
-          <w:b/>
-          <w:bCs/>
-          <w:color w:val="auto"/>
-          <w:sz w:val="36"/>
-          <w:szCs w:val="36"/>
-          <w:highlight w:val="none"/>
-          <w:u w:val="single"/>
         </w:rPr>
         <w:t>{party.counterparty.name}</w:t>
       </w:r>
@@ -744,20 +465,41 @@
     </w:p>
     <w:tbl>
       <w:tblPr>
-        <w:tblW w:w="0" w:type="auto"/>
+        <w:tblW w:w="5000" w:type="pct"/>
+        <w:jc w:val="center"/>
+        <w:tblLayout w:type="fixed"/>
+        <w:tblCellMar>
+          <w:top w:w="60" w:type="dxa"/>
+          <w:start w:w="80" w:type="dxa"/>
+          <w:bottom w:w="60" w:type="dxa"/>
+          <w:end w:w="80" w:type="dxa"/>
+        </w:tblCellMar>
         <w:tblBorders>
           <w:top w:val="single" w:sz="4" w:space="0" w:color="000000"/>
-          <w:start w:val="single" w:sz="4" w:space="0" w:color="000000"/>
+          <w:left w:val="single" w:sz="4" w:space="0" w:color="000000"/>
           <w:bottom w:val="single" w:sz="4" w:space="0" w:color="000000"/>
-          <w:end w:val="single" w:sz="4" w:space="0" w:color="000000"/>
+          <w:right w:val="single" w:sz="4" w:space="0" w:color="000000"/>
           <w:insideH w:val="single" w:sz="4" w:space="0" w:color="000000"/>
           <w:insideV w:val="single" w:sz="4" w:space="0" w:color="000000"/>
         </w:tblBorders>
       </w:tblPr>
+      <w:tblGrid>
+        <w:gridCol w:w="1361"/>
+        <w:gridCol w:w="935"/>
+        <w:gridCol w:w="680"/>
+        <w:gridCol w:w="680"/>
+        <w:gridCol w:w="1276"/>
+        <w:gridCol w:w="510"/>
+        <w:gridCol w:w="1191"/>
+        <w:gridCol w:w="1871"/>
+      </w:tblGrid>
       <w:tr>
+        <w:trPr>
+          <w:cantSplit/>
+        </w:trPr>
         <w:tc>
           <w:tcPr>
-            <w:tcW w:w="1800" w:type="dxa"/>
+            <w:tcW w:w="1361" w:type="dxa"/>
             <w:tcBorders>
               <w:top w:val="single" w:sz="4" w:space="0" w:color="000000"/>
               <w:start w:val="single" w:sz="4" w:space="0" w:color="000000"/>
@@ -766,6 +508,9 @@
             </w:tcBorders>
           </w:tcPr>
           <w:p>
+            <w:pPr>
+              <w:pStyle w:val="ContractTableText"/>
+            </w:pPr>
             <w:r>
               <w:t xml:space="preserve">机械设备名称或费用名称</w:t>
             </w:r>
@@ -773,7 +518,7 @@
         </w:tc>
         <w:tc>
           <w:tcPr>
-            <w:tcW w:w="1800" w:type="dxa"/>
+            <w:tcW w:w="935" w:type="dxa"/>
             <w:tcBorders>
               <w:top w:val="single" w:sz="4" w:space="0" w:color="000000"/>
               <w:start w:val="single" w:sz="4" w:space="0" w:color="000000"/>
@@ -782,6 +527,9 @@
             </w:tcBorders>
           </w:tcPr>
           <w:p>
+            <w:pPr>
+              <w:pStyle w:val="ContractTableText"/>
+            </w:pPr>
             <w:r>
               <w:t xml:space="preserve">规格型号</w:t>
             </w:r>
@@ -789,7 +537,7 @@
         </w:tc>
         <w:tc>
           <w:tcPr>
-            <w:tcW w:w="1800" w:type="dxa"/>
+            <w:tcW w:w="680" w:type="dxa"/>
             <w:tcBorders>
               <w:top w:val="single" w:sz="4" w:space="0" w:color="000000"/>
               <w:start w:val="single" w:sz="4" w:space="0" w:color="000000"/>
@@ -798,6 +546,9 @@
             </w:tcBorders>
           </w:tcPr>
           <w:p>
+            <w:pPr>
+              <w:pStyle w:val="ContractTableText"/>
+            </w:pPr>
             <w:r>
               <w:t xml:space="preserve">暂估数量</w:t>
             </w:r>
@@ -805,7 +556,7 @@
         </w:tc>
         <w:tc>
           <w:tcPr>
-            <w:tcW w:w="1800" w:type="dxa"/>
+            <w:tcW w:w="680" w:type="dxa"/>
             <w:tcBorders>
               <w:top w:val="single" w:sz="4" w:space="0" w:color="000000"/>
               <w:start w:val="single" w:sz="4" w:space="0" w:color="000000"/>
@@ -814,6 +565,9 @@
             </w:tcBorders>
           </w:tcPr>
           <w:p>
+            <w:pPr>
+              <w:pStyle w:val="ContractTableText"/>
+            </w:pPr>
             <w:r>
               <w:t xml:space="preserve">计价单位</w:t>
             </w:r>
@@ -821,7 +575,7 @@
         </w:tc>
         <w:tc>
           <w:tcPr>
-            <w:tcW w:w="1800" w:type="dxa"/>
+            <w:tcW w:w="1276" w:type="dxa"/>
             <w:tcBorders>
               <w:top w:val="single" w:sz="4" w:space="0" w:color="000000"/>
               <w:start w:val="single" w:sz="4" w:space="0" w:color="000000"/>
@@ -830,6 +584,9 @@
             </w:tcBorders>
           </w:tcPr>
           <w:p>
+            <w:pPr>
+              <w:pStyle w:val="ContractTableText"/>
+            </w:pPr>
             <w:r>
               <w:t xml:space="preserve">含税租金单价</w:t>
             </w:r>
@@ -837,7 +594,7 @@
         </w:tc>
         <w:tc>
           <w:tcPr>
-            <w:tcW w:w="1800" w:type="dxa"/>
+            <w:tcW w:w="510" w:type="dxa"/>
             <w:tcBorders>
               <w:top w:val="single" w:sz="4" w:space="0" w:color="000000"/>
               <w:start w:val="single" w:sz="4" w:space="0" w:color="000000"/>
@@ -846,6 +603,9 @@
             </w:tcBorders>
           </w:tcPr>
           <w:p>
+            <w:pPr>
+              <w:pStyle w:val="ContractTableText"/>
+            </w:pPr>
             <w:r>
               <w:t xml:space="preserve">税率(%)</w:t>
             </w:r>
@@ -853,7 +613,7 @@
         </w:tc>
         <w:tc>
           <w:tcPr>
-            <w:tcW w:w="1800" w:type="dxa"/>
+            <w:tcW w:w="1191" w:type="dxa"/>
             <w:tcBorders>
               <w:top w:val="single" w:sz="4" w:space="0" w:color="000000"/>
               <w:start w:val="single" w:sz="4" w:space="0" w:color="000000"/>
@@ -862,6 +622,9 @@
             </w:tcBorders>
           </w:tcPr>
           <w:p>
+            <w:pPr>
+              <w:pStyle w:val="ContractTableText"/>
+            </w:pPr>
             <w:r>
               <w:t xml:space="preserve">价税合计租金</w:t>
             </w:r>
@@ -869,7 +632,7 @@
         </w:tc>
         <w:tc>
           <w:tcPr>
-            <w:tcW w:w="1800" w:type="dxa"/>
+            <w:tcW w:w="1871" w:type="dxa"/>
             <w:tcBorders>
               <w:top w:val="single" w:sz="4" w:space="0" w:color="000000"/>
               <w:start w:val="single" w:sz="4" w:space="0" w:color="000000"/>
@@ -878,6 +641,9 @@
             </w:tcBorders>
           </w:tcPr>
           <w:p>
+            <w:pPr>
+              <w:pStyle w:val="ContractTableText"/>
+            </w:pPr>
             <w:r>
               <w:t xml:space="preserve">备注</w:t>
             </w:r>
@@ -885,9 +651,12 @@
         </w:tc>
       </w:tr>
       <w:tr>
+        <w:trPr>
+          <w:cantSplit/>
+        </w:trPr>
         <w:tc>
           <w:tcPr>
-            <w:tcW w:w="1800" w:type="dxa"/>
+            <w:tcW w:w="1361" w:type="dxa"/>
             <w:tcBorders>
               <w:top w:val="single" w:sz="4" w:space="0" w:color="000000"/>
               <w:start w:val="single" w:sz="4" w:space="0" w:color="000000"/>
@@ -896,6 +665,9 @@
             </w:tcBorders>
           </w:tcPr>
           <w:p>
+            <w:pPr>
+              <w:pStyle w:val="ContractTableText"/>
+            </w:pPr>
             <w:r>
               <w:t xml:space="preserve">{itemName}</w:t>
             </w:r>
@@ -903,7 +675,7 @@
         </w:tc>
         <w:tc>
           <w:tcPr>
-            <w:tcW w:w="1800" w:type="dxa"/>
+            <w:tcW w:w="935" w:type="dxa"/>
             <w:tcBorders>
               <w:top w:val="single" w:sz="4" w:space="0" w:color="000000"/>
               <w:start w:val="single" w:sz="4" w:space="0" w:color="000000"/>
@@ -912,6 +684,9 @@
             </w:tcBorders>
           </w:tcPr>
           <w:p>
+            <w:pPr>
+              <w:pStyle w:val="ContractTableText"/>
+            </w:pPr>
             <w:r>
               <w:t xml:space="preserve">{specification}</w:t>
             </w:r>
@@ -919,7 +694,7 @@
         </w:tc>
         <w:tc>
           <w:tcPr>
-            <w:tcW w:w="1800" w:type="dxa"/>
+            <w:tcW w:w="680" w:type="dxa"/>
             <w:tcBorders>
               <w:top w:val="single" w:sz="4" w:space="0" w:color="000000"/>
               <w:start w:val="single" w:sz="4" w:space="0" w:color="000000"/>
@@ -928,6 +703,9 @@
             </w:tcBorders>
           </w:tcPr>
           <w:p>
+            <w:pPr>
+              <w:pStyle w:val="ContractTableText"/>
+            </w:pPr>
             <w:r>
               <w:t xml:space="preserve">{quantity}</w:t>
             </w:r>
@@ -935,7 +713,7 @@
         </w:tc>
         <w:tc>
           <w:tcPr>
-            <w:tcW w:w="1800" w:type="dxa"/>
+            <w:tcW w:w="680" w:type="dxa"/>
             <w:tcBorders>
               <w:top w:val="single" w:sz="4" w:space="0" w:color="000000"/>
               <w:start w:val="single" w:sz="4" w:space="0" w:color="000000"/>
@@ -944,6 +722,9 @@
             </w:tcBorders>
           </w:tcPr>
           <w:p>
+            <w:pPr>
+              <w:pStyle w:val="ContractTableText"/>
+            </w:pPr>
             <w:r>
               <w:t xml:space="preserve">{unit}</w:t>
             </w:r>
@@ -951,7 +732,7 @@
         </w:tc>
         <w:tc>
           <w:tcPr>
-            <w:tcW w:w="1800" w:type="dxa"/>
+            <w:tcW w:w="1276" w:type="dxa"/>
             <w:tcBorders>
               <w:top w:val="single" w:sz="4" w:space="0" w:color="000000"/>
               <w:start w:val="single" w:sz="4" w:space="0" w:color="000000"/>
@@ -960,6 +741,9 @@
             </w:tcBorders>
           </w:tcPr>
           <w:p>
+            <w:pPr>
+              <w:pStyle w:val="ContractTableText"/>
+            </w:pPr>
             <w:r>
               <w:t xml:space="preserve">{unitPrice}</w:t>
             </w:r>
@@ -967,7 +751,7 @@
         </w:tc>
         <w:tc>
           <w:tcPr>
-            <w:tcW w:w="1800" w:type="dxa"/>
+            <w:tcW w:w="510" w:type="dxa"/>
             <w:tcBorders>
               <w:top w:val="single" w:sz="4" w:space="0" w:color="000000"/>
               <w:start w:val="single" w:sz="4" w:space="0" w:color="000000"/>
@@ -976,6 +760,9 @@
             </w:tcBorders>
           </w:tcPr>
           <w:p>
+            <w:pPr>
+              <w:pStyle w:val="ContractTableText"/>
+            </w:pPr>
             <w:r>
               <w:t xml:space="preserve">{taxRatePercent}</w:t>
             </w:r>
@@ -983,7 +770,7 @@
         </w:tc>
         <w:tc>
           <w:tcPr>
-            <w:tcW w:w="1800" w:type="dxa"/>
+            <w:tcW w:w="1191" w:type="dxa"/>
             <w:tcBorders>
               <w:top w:val="single" w:sz="4" w:space="0" w:color="000000"/>
               <w:start w:val="single" w:sz="4" w:space="0" w:color="000000"/>
@@ -992,6 +779,9 @@
             </w:tcBorders>
           </w:tcPr>
           <w:p>
+            <w:pPr>
+              <w:pStyle w:val="ContractTableText"/>
+            </w:pPr>
             <w:r>
               <w:t xml:space="preserve">{taxInclusiveAmount}</w:t>
             </w:r>
@@ -999,7 +789,7 @@
         </w:tc>
         <w:tc>
           <w:tcPr>
-            <w:tcW w:w="1800" w:type="dxa"/>
+            <w:tcW w:w="1871" w:type="dxa"/>
             <w:tcBorders>
               <w:top w:val="single" w:sz="4" w:space="0" w:color="000000"/>
               <w:start w:val="single" w:sz="4" w:space="0" w:color="000000"/>
@@ -1008,6 +798,9 @@
             </w:tcBorders>
           </w:tcPr>
           <w:p>
+            <w:pPr>
+              <w:pStyle w:val="ContractTableText"/>
+            </w:pPr>
             <w:r>
               <w:t xml:space="preserve">{remark}</w:t>
             </w:r>
@@ -12106,28 +11899,27 @@
     </w:p>
     <w:tbl>
       <w:tblPr>
-        <w:tblStyle w:val="17"/>
-        <w:tblW w:w="10201" w:type="dxa"/>
+        <w:tblW w:w="5000" w:type="pct"/>
         <w:jc w:val="center"/>
-        <w:tblBorders>
-          <w:top w:val="single" w:color="auto" w:sz="4" w:space="0"/>
-          <w:left w:val="single" w:color="auto" w:sz="4" w:space="0"/>
-          <w:bottom w:val="single" w:color="auto" w:sz="4" w:space="0"/>
-          <w:right w:val="single" w:color="auto" w:sz="4" w:space="0"/>
-          <w:insideH w:val="single" w:color="auto" w:sz="4" w:space="0"/>
-          <w:insideV w:val="single" w:color="auto" w:sz="4" w:space="0"/>
-        </w:tblBorders>
         <w:tblLayout w:type="fixed"/>
         <w:tblCellMar>
-          <w:top w:w="0" w:type="dxa"/>
-          <w:left w:w="108" w:type="dxa"/>
-          <w:bottom w:w="0" w:type="dxa"/>
-          <w:right w:w="108" w:type="dxa"/>
+          <w:top w:w="60" w:type="dxa"/>
+          <w:start w:w="80" w:type="dxa"/>
+          <w:bottom w:w="60" w:type="dxa"/>
+          <w:end w:w="80" w:type="dxa"/>
         </w:tblCellMar>
+        <w:tblBorders>
+          <w:top w:val="single" w:sz="4" w:space="0" w:color="000000"/>
+          <w:left w:val="single" w:sz="4" w:space="0" w:color="000000"/>
+          <w:bottom w:val="single" w:sz="4" w:space="0" w:color="000000"/>
+          <w:right w:val="single" w:sz="4" w:space="0" w:color="000000"/>
+          <w:insideH w:val="single" w:sz="4" w:space="0" w:color="000000"/>
+          <w:insideV w:val="single" w:sz="4" w:space="0" w:color="000000"/>
+        </w:tblBorders>
       </w:tblPr>
       <w:tblGrid>
-        <w:gridCol w:w="5098"/>
-        <w:gridCol w:w="5103"/>
+        <w:gridCol w:w="4252"/>
+        <w:gridCol w:w="4252"/>
       </w:tblGrid>
       <w:tr>
         <w:tblPrEx>
@@ -12147,171 +11939,81 @@
           </w:tblCellMar>
         </w:tblPrEx>
         <w:trPr>
-          <w:trHeight w:val="3073" w:hRule="atLeast"/>
-          <w:jc w:val="center"/>
+          <w:cantSplit/>
         </w:trPr>
         <w:tc>
           <w:tcPr>
-            <w:tcW w:w="5098" w:type="dxa"/>
+            <w:tcW w:w="4252" w:type="dxa"/>
           </w:tcPr>
           <w:p>
-            <w:pPr>
-              <w:keepNext w:val="0"/>
-              <w:keepLines w:val="0"/>
-              <w:suppressLineNumbers w:val="0"/>
-              <w:spacing w:before="0" w:after="0" w:line="500" w:lineRule="exact"/>
-              <w:ind w:left="0" w:right="0"/>
-              <w:jc w:val="center"/>
-              <w:rPr>
-                <w:rFonts w:hint="eastAsia" w:ascii="Times New Roman" w:hAnsi="Times New Roman" w:eastAsia="仿宋_GB2312" w:cs="Times New Roman"/>
-                <w:color w:val="000000"/>
-                <w:sz w:val="28"/>
-                <w:szCs w:val="28"/>
-                <w:highlight w:val="none"/>
-              </w:rPr>
-            </w:pPr>
             <w:r>
               <w:rPr>
                 <w:rFonts w:hint="eastAsia" w:ascii="Times New Roman" w:hAnsi="Times New Roman" w:eastAsia="仿宋_GB2312" w:cs="Times New Roman"/>
                 <w:b/>
                 <w:bCs/>
                 <w:color w:val="000000"/>
-                <w:sz w:val="28"/>
-                <w:szCs w:val="28"/>
+                <w:sz w:val="18"/>
+                <w:szCs w:val="18"/>
                 <w:highlight w:val="none"/>
               </w:rPr>
               <w:t>甲  方</w:t>
             </w:r>
           </w:p>
           <w:p>
-            <w:pPr>
-              <w:keepNext w:val="0"/>
-              <w:keepLines w:val="0"/>
-              <w:suppressLineNumbers w:val="0"/>
-              <w:spacing w:before="0" w:after="0" w:line="500" w:lineRule="exact"/>
-              <w:ind w:left="0" w:right="0"/>
-              <w:jc w:val="left"/>
-              <w:rPr>
-                <w:rFonts w:hint="eastAsia" w:ascii="Times New Roman" w:hAnsi="Times New Roman" w:eastAsia="仿宋_GB2312" w:cs="Times New Roman"/>
-                <w:color w:val="000000"/>
-                <w:sz w:val="28"/>
-                <w:szCs w:val="28"/>
-                <w:highlight w:val="none"/>
-              </w:rPr>
-            </w:pPr>
             <w:r>
               <w:rPr>
                 <w:rFonts w:hint="eastAsia" w:ascii="Times New Roman" w:hAnsi="Times New Roman" w:eastAsia="仿宋_GB2312" w:cs="Times New Roman"/>
                 <w:color w:val="000000"/>
-                <w:sz w:val="28"/>
-                <w:szCs w:val="28"/>
+                <w:sz w:val="18"/>
+                <w:szCs w:val="18"/>
                 <w:highlight w:val="none"/>
               </w:rPr>
               <w:t>单位名称（章）：{party.owner.name}</w:t>
             </w:r>
           </w:p>
           <w:p>
-            <w:pPr>
-              <w:keepNext w:val="0"/>
-              <w:keepLines w:val="0"/>
-              <w:suppressLineNumbers w:val="0"/>
-              <w:spacing w:before="0" w:after="0" w:line="500" w:lineRule="exact"/>
-              <w:ind w:left="0" w:right="0"/>
-              <w:jc w:val="left"/>
-              <w:rPr>
-                <w:rFonts w:hint="eastAsia" w:ascii="Times New Roman" w:hAnsi="Times New Roman" w:eastAsia="仿宋_GB2312" w:cs="Times New Roman"/>
-                <w:color w:val="000000"/>
-                <w:sz w:val="28"/>
-                <w:szCs w:val="28"/>
-                <w:highlight w:val="none"/>
-              </w:rPr>
-            </w:pPr>
             <w:r>
               <w:rPr>
                 <w:rFonts w:hint="eastAsia" w:ascii="Times New Roman" w:hAnsi="Times New Roman" w:eastAsia="仿宋_GB2312" w:cs="Times New Roman"/>
                 <w:color w:val="000000"/>
-                <w:sz w:val="28"/>
-                <w:szCs w:val="28"/>
+                <w:sz w:val="18"/>
+                <w:szCs w:val="18"/>
                 <w:highlight w:val="none"/>
               </w:rPr>
               <w:t>单位地址：</w:t>
             </w:r>
           </w:p>
           <w:p>
-            <w:pPr>
-              <w:keepNext w:val="0"/>
-              <w:keepLines w:val="0"/>
-              <w:suppressLineNumbers w:val="0"/>
-              <w:spacing w:before="0" w:after="0" w:line="500" w:lineRule="exact"/>
-              <w:ind w:left="0" w:right="0"/>
-              <w:jc w:val="left"/>
-              <w:rPr>
-                <w:rFonts w:hint="eastAsia" w:ascii="Times New Roman" w:hAnsi="Times New Roman" w:eastAsia="仿宋_GB2312" w:cs="Times New Roman"/>
-                <w:color w:val="000000"/>
-                <w:sz w:val="28"/>
-                <w:szCs w:val="28"/>
-                <w:highlight w:val="none"/>
-              </w:rPr>
-            </w:pPr>
             <w:r>
               <w:rPr>
                 <w:rFonts w:hint="eastAsia" w:ascii="Times New Roman" w:hAnsi="Times New Roman" w:eastAsia="仿宋_GB2312" w:cs="Times New Roman"/>
                 <w:color w:val="000000"/>
-                <w:sz w:val="28"/>
-                <w:szCs w:val="28"/>
+                <w:sz w:val="18"/>
+                <w:szCs w:val="18"/>
                 <w:highlight w:val="none"/>
               </w:rPr>
               <w:t>法定代表人:</w:t>
             </w:r>
           </w:p>
           <w:p>
-            <w:pPr>
-              <w:keepNext w:val="0"/>
-              <w:keepLines w:val="0"/>
-              <w:suppressLineNumbers w:val="0"/>
-              <w:spacing w:before="0" w:after="0" w:line="500" w:lineRule="exact"/>
-              <w:ind w:left="0" w:right="0"/>
-              <w:jc w:val="left"/>
-              <w:rPr>
-                <w:rFonts w:hint="eastAsia" w:ascii="Times New Roman" w:hAnsi="Times New Roman" w:eastAsia="仿宋_GB2312" w:cs="Times New Roman"/>
-                <w:color w:val="000000"/>
-                <w:sz w:val="28"/>
-                <w:szCs w:val="28"/>
-                <w:highlight w:val="none"/>
-              </w:rPr>
-            </w:pPr>
             <w:r>
               <w:rPr>
                 <w:rFonts w:hint="eastAsia" w:ascii="Times New Roman" w:hAnsi="Times New Roman" w:eastAsia="仿宋_GB2312" w:cs="Times New Roman"/>
                 <w:color w:val="000000"/>
-                <w:sz w:val="28"/>
-                <w:szCs w:val="28"/>
+                <w:sz w:val="18"/>
+                <w:szCs w:val="18"/>
                 <w:highlight w:val="none"/>
               </w:rPr>
               <w:t>委托代理人：</w:t>
             </w:r>
           </w:p>
           <w:p>
-            <w:pPr>
-              <w:keepNext w:val="0"/>
-              <w:keepLines w:val="0"/>
-              <w:suppressLineNumbers w:val="0"/>
-              <w:spacing w:before="0" w:after="0" w:line="500" w:lineRule="exact"/>
-              <w:ind w:left="0" w:right="0"/>
-              <w:rPr>
-                <w:rFonts w:hint="eastAsia" w:ascii="Times New Roman" w:hAnsi="Times New Roman" w:eastAsia="仿宋_GB2312" w:cs="Times New Roman"/>
-                <w:color w:val="000000"/>
-                <w:sz w:val="28"/>
-                <w:szCs w:val="28"/>
-                <w:highlight w:val="none"/>
-              </w:rPr>
-            </w:pPr>
             <w:r>
               <w:rPr>
                 <w:rFonts w:hint="eastAsia" w:ascii="Times New Roman" w:hAnsi="Times New Roman" w:eastAsia="仿宋_GB2312" w:cs="Times New Roman"/>
                 <w:color w:val="000000"/>
-                <w:sz w:val="28"/>
-                <w:szCs w:val="28"/>
+                <w:sz w:val="18"/>
+                <w:szCs w:val="18"/>
                 <w:highlight w:val="none"/>
               </w:rPr>
               <w:t>经办人：</w:t>
@@ -12320,167 +12022,77 @@
         </w:tc>
         <w:tc>
           <w:tcPr>
-            <w:tcW w:w="5103" w:type="dxa"/>
+            <w:tcW w:w="4252" w:type="dxa"/>
           </w:tcPr>
           <w:p>
-            <w:pPr>
-              <w:keepNext w:val="0"/>
-              <w:keepLines w:val="0"/>
-              <w:suppressLineNumbers w:val="0"/>
-              <w:spacing w:before="0" w:after="0" w:line="500" w:lineRule="exact"/>
-              <w:ind w:left="0" w:right="0"/>
-              <w:jc w:val="center"/>
-              <w:rPr>
-                <w:rFonts w:hint="eastAsia" w:ascii="Times New Roman" w:hAnsi="Times New Roman" w:eastAsia="仿宋_GB2312" w:cs="Times New Roman"/>
-                <w:color w:val="000000"/>
-                <w:sz w:val="28"/>
-                <w:szCs w:val="28"/>
-                <w:highlight w:val="none"/>
-              </w:rPr>
-            </w:pPr>
             <w:r>
               <w:rPr>
                 <w:rFonts w:hint="eastAsia" w:ascii="Times New Roman" w:hAnsi="Times New Roman" w:eastAsia="仿宋_GB2312" w:cs="Times New Roman"/>
                 <w:b/>
                 <w:bCs/>
                 <w:color w:val="000000"/>
-                <w:sz w:val="28"/>
-                <w:szCs w:val="28"/>
+                <w:sz w:val="18"/>
+                <w:szCs w:val="18"/>
                 <w:highlight w:val="none"/>
               </w:rPr>
               <w:t>乙  方</w:t>
             </w:r>
           </w:p>
           <w:p>
-            <w:pPr>
-              <w:keepNext w:val="0"/>
-              <w:keepLines w:val="0"/>
-              <w:suppressLineNumbers w:val="0"/>
-              <w:spacing w:before="0" w:after="0" w:line="500" w:lineRule="exact"/>
-              <w:ind w:left="0" w:right="0"/>
-              <w:jc w:val="left"/>
-              <w:rPr>
-                <w:rFonts w:hint="eastAsia" w:ascii="Times New Roman" w:hAnsi="Times New Roman" w:eastAsia="仿宋_GB2312" w:cs="Times New Roman"/>
-                <w:color w:val="000000"/>
-                <w:sz w:val="28"/>
-                <w:szCs w:val="28"/>
-                <w:highlight w:val="none"/>
-              </w:rPr>
-            </w:pPr>
             <w:r>
               <w:rPr>
                 <w:rFonts w:hint="eastAsia" w:ascii="Times New Roman" w:hAnsi="Times New Roman" w:eastAsia="仿宋_GB2312" w:cs="Times New Roman"/>
                 <w:color w:val="000000"/>
-                <w:sz w:val="28"/>
-                <w:szCs w:val="28"/>
+                <w:sz w:val="18"/>
+                <w:szCs w:val="18"/>
                 <w:highlight w:val="none"/>
               </w:rPr>
               <w:t>单位名称（章）：{party.counterparty.name}</w:t>
             </w:r>
           </w:p>
           <w:p>
-            <w:pPr>
-              <w:keepNext w:val="0"/>
-              <w:keepLines w:val="0"/>
-              <w:suppressLineNumbers w:val="0"/>
-              <w:spacing w:before="0" w:after="0" w:line="500" w:lineRule="exact"/>
-              <w:ind w:left="0" w:right="0"/>
-              <w:jc w:val="left"/>
-              <w:rPr>
-                <w:rFonts w:hint="eastAsia" w:ascii="Times New Roman" w:hAnsi="Times New Roman" w:eastAsia="仿宋_GB2312" w:cs="Times New Roman"/>
-                <w:color w:val="000000"/>
-                <w:sz w:val="28"/>
-                <w:szCs w:val="28"/>
-                <w:highlight w:val="none"/>
-              </w:rPr>
-            </w:pPr>
             <w:r>
               <w:rPr>
                 <w:rFonts w:hint="eastAsia" w:ascii="Times New Roman" w:hAnsi="Times New Roman" w:eastAsia="仿宋_GB2312" w:cs="Times New Roman"/>
                 <w:color w:val="000000"/>
-                <w:sz w:val="28"/>
-                <w:szCs w:val="28"/>
+                <w:sz w:val="18"/>
+                <w:szCs w:val="18"/>
                 <w:highlight w:val="none"/>
               </w:rPr>
               <w:t>单位地址：</w:t>
             </w:r>
           </w:p>
           <w:p>
-            <w:pPr>
-              <w:keepNext w:val="0"/>
-              <w:keepLines w:val="0"/>
-              <w:suppressLineNumbers w:val="0"/>
-              <w:spacing w:before="0" w:after="0" w:line="500" w:lineRule="exact"/>
-              <w:ind w:left="0" w:right="0"/>
-              <w:jc w:val="left"/>
-              <w:rPr>
-                <w:rFonts w:hint="eastAsia" w:ascii="Times New Roman" w:hAnsi="Times New Roman" w:eastAsia="仿宋_GB2312" w:cs="Times New Roman"/>
-                <w:color w:val="000000"/>
-                <w:sz w:val="28"/>
-                <w:szCs w:val="28"/>
-                <w:highlight w:val="none"/>
-              </w:rPr>
-            </w:pPr>
             <w:r>
               <w:rPr>
                 <w:rFonts w:hint="eastAsia" w:ascii="Times New Roman" w:hAnsi="Times New Roman" w:eastAsia="仿宋_GB2312" w:cs="Times New Roman"/>
                 <w:color w:val="000000"/>
-                <w:sz w:val="28"/>
-                <w:szCs w:val="28"/>
+                <w:sz w:val="18"/>
+                <w:szCs w:val="18"/>
                 <w:highlight w:val="none"/>
               </w:rPr>
               <w:t>法定代表人:</w:t>
             </w:r>
           </w:p>
           <w:p>
-            <w:pPr>
-              <w:keepNext w:val="0"/>
-              <w:keepLines w:val="0"/>
-              <w:suppressLineNumbers w:val="0"/>
-              <w:spacing w:before="0" w:after="0" w:line="500" w:lineRule="exact"/>
-              <w:ind w:left="0" w:right="0"/>
-              <w:jc w:val="left"/>
-              <w:rPr>
-                <w:rFonts w:hint="eastAsia" w:ascii="Times New Roman" w:hAnsi="Times New Roman" w:eastAsia="仿宋_GB2312" w:cs="Times New Roman"/>
-                <w:color w:val="000000"/>
-                <w:sz w:val="28"/>
-                <w:szCs w:val="28"/>
-                <w:highlight w:val="none"/>
-              </w:rPr>
-            </w:pPr>
             <w:r>
               <w:rPr>
                 <w:rFonts w:hint="eastAsia" w:ascii="Times New Roman" w:hAnsi="Times New Roman" w:eastAsia="仿宋_GB2312" w:cs="Times New Roman"/>
                 <w:color w:val="000000"/>
-                <w:sz w:val="28"/>
-                <w:szCs w:val="28"/>
+                <w:sz w:val="18"/>
+                <w:szCs w:val="18"/>
                 <w:highlight w:val="none"/>
               </w:rPr>
               <w:t>委托代理人：</w:t>
             </w:r>
           </w:p>
           <w:p>
-            <w:pPr>
-              <w:keepNext w:val="0"/>
-              <w:keepLines w:val="0"/>
-              <w:suppressLineNumbers w:val="0"/>
-              <w:spacing w:before="0" w:after="0" w:line="500" w:lineRule="exact"/>
-              <w:ind w:left="0" w:right="0"/>
-              <w:jc w:val="left"/>
-              <w:rPr>
-                <w:rFonts w:hint="eastAsia" w:ascii="Times New Roman" w:hAnsi="Times New Roman" w:eastAsia="仿宋_GB2312" w:cs="Times New Roman"/>
-                <w:color w:val="000000"/>
-                <w:sz w:val="28"/>
-                <w:szCs w:val="28"/>
-                <w:highlight w:val="none"/>
-              </w:rPr>
-            </w:pPr>
             <w:r>
               <w:rPr>
                 <w:rFonts w:hint="eastAsia" w:ascii="Times New Roman" w:hAnsi="Times New Roman" w:eastAsia="仿宋_GB2312" w:cs="Times New Roman"/>
                 <w:color w:val="000000"/>
-                <w:sz w:val="28"/>
-                <w:szCs w:val="28"/>
+                <w:sz w:val="18"/>
+                <w:szCs w:val="18"/>
                 <w:highlight w:val="none"/>
               </w:rPr>
               <w:t>经办人：</w:t>
@@ -12581,8 +12193,8 @@
       </w:r>
     </w:p>
     <w:sectPr>
-      <w:headerReference w:type="default" r:id="rIdContractWatermarkHeader"/>
-      <w:footerReference w:type="default" r:id="rIdContractTemplateFooter"/>
+      <w:headerReference w:type="default" r:id="rIdHeader1"/>
+      <w:footerReference w:type="default" r:id="rIdFooter1"/>
       <w:pgSz w:w="11906" w:h="16838"/>
       <w:pgMar w:top="1417" w:right="1701" w:bottom="1417" w:left="1701" w:header="720" w:footer="720" w:gutter="0"/>
       <w:pgNumType w:fmt="decimal"/>
@@ -12702,6 +12314,33 @@
       <w:rFonts w:ascii="Times New Roman" w:hAnsi="Times New Roman" w:eastAsia="仿宋_GB2312" w:cs="Times New Roman"/>
       <w:sz w:val="28"/>
       <w:szCs w:val="28"/>
+    </w:rPr>
+  </w:style>
+  <w:style w:type="paragraph" w:styleId="ContractCoverTitle">
+    <w:name w:val="Contract Cover Title"/>
+    <w:basedOn w:val="ContractTitle"/>
+    <w:pPr>
+      <w:spacing w:before="0" w:after="0" w:line="500" w:lineRule="exact"/>
+      <w:jc w:val="center"/>
+    </w:pPr>
+    <w:rPr>
+      <w:rFonts w:ascii="Times New Roman" w:hAnsi="Times New Roman" w:eastAsia="方正小标宋简体" w:cs="Times New Roman"/>
+      <w:sz w:val="44"/>
+      <w:szCs w:val="44"/>
+    </w:rPr>
+  </w:style>
+  <w:style w:type="paragraph" w:styleId="ContractTableText">
+    <w:name w:val="Contract Table Text"/>
+    <w:basedOn w:val="Normal"/>
+    <w:pPr>
+      <w:spacing w:before="0" w:after="0" w:line="300" w:lineRule="auto"/>
+      <w:ind w:firstLineChars="0"/>
+      <w:jc w:val="center"/>
+    </w:pPr>
+    <w:rPr>
+      <w:rFonts w:ascii="Times New Roman" w:hAnsi="Times New Roman" w:eastAsia="仿宋_GB2312" w:cs="Times New Roman"/>
+      <w:sz w:val="18"/>
+      <w:szCs w:val="18"/>
     </w:rPr>
   </w:style>
 </w:styles>

</xml_diff>